<commit_message>
Add Elaine Yao part-time HC and homework payroll rates.
Seed 兼職 HC (junior $120+$50, senior $150+$70) and $100/hr homework rates effective 2026-09-01, and document the contract terms in PAYROLL_GUIDE.
</commit_message>
<xml_diff>
--- a/docs/generated/payroll/PAYROLL_GUIDE.docx
+++ b/docs/generated/payroll/PAYROLL_GUIDE.docx
@@ -97,7 +97,7 @@
           <w:color w:val="000000"/>
           <w:lang w:eastAsia="zh-HK"/>
         </w:rPr>
-        <w:t xml:space="preserve"> 2026-08-21　</w:t>
+        <w:t xml:space="preserve"> 2026-09-10　</w:t>
       </w:r>
       <w:r>
         <w:rPr>
@@ -145,7 +145,7 @@
           <w:color w:val="000000"/>
           <w:lang w:eastAsia="zh-HK"/>
         </w:rPr>
-        <w:t xml:space="preserve"> 計糧引擎已接專科班分成／人頭、固定月薪、獨立定價、在家工作時薪及強積金。計糧頁合計已拆扣堂／實際到課／no show／不扣堂請假／未點名；財務可發送點名提醒（老師收件匣）或排除該人。Natalie Kwok 私人課程一對一固定 $350／節已寫入本指南，系統費率尚未覆寫；出糧前按第 7.5 節人手核對。</w:t>
+        <w:t xml:space="preserve"> 計糧引擎已接專科班分成／人頭、固定月薪、獨立定價、在家工作時薪、功輔時薪、Christine 功輔佣金及強積金。計糧頁合計已拆扣堂／實際到課／no show／不扣堂請假／未點名；財務可發送點名提醒（老師收件匣）或排除該人。未結算月份顯示上次計算（約 10 分鐘內進頁不重算）；點名、排程或工時有變須按「重算」。提交管理層核實後金額固定為該次計算，不會因之後點名自動改數。Natalie Kwok 私人課程一對一固定 $350／節已寫入費率；未結算月份按「重算」後即依此計，無須再按等效人頭人手改數。</w:t>
       </w:r>
     </w:p>
     <w:p>
@@ -663,7 +663,7 @@
           <w:color w:val="000000"/>
           <w:lang w:eastAsia="zh-HK"/>
         </w:rPr>
-        <w:t>暫不納入本指南的項目</w:t>
+        <w:t>功課輔導班時薪與 Christine 功輔佣金</w:t>
       </w:r>
     </w:p>
     <w:p>
@@ -754,7 +754,7 @@
           <w:color w:val="000000"/>
           <w:lang w:eastAsia="zh-HK"/>
         </w:rPr>
-        <w:t>本指南涵蓋專科班授課薪酬、固定月薪、獨立定價、在家工作時薪，以及指定同事的強積金計算。</w:t>
+        <w:t>本指南涵蓋專科班授課薪酬、固定月薪、獨立定價、在家工作時薪、功課輔導班時薪、Christine Fan 功輔佣金，以及指定同事的強積金計算。</w:t>
       </w:r>
     </w:p>
     <w:p>
@@ -4504,7 +4504,7 @@
                 <w:color w:val="000000"/>
                 <w:lang w:eastAsia="zh-HK"/>
               </w:rPr>
-              <w:t>Natalie Kwok</w:t>
+              <w:t>Elaine Yao</w:t>
             </w:r>
           </w:p>
         </w:tc>
@@ -4562,7 +4562,7 @@
                 <w:color w:val="000000"/>
                 <w:lang w:eastAsia="zh-HK"/>
               </w:rPr>
-              <w:t>專科班按人頭；私人課程一對一固定 $350／節</w:t>
+              <w:t>按人頭計薪（初中其後每人頭 +$50；見第 7.6 節）</w:t>
             </w:r>
           </w:p>
         </w:tc>
@@ -4622,7 +4622,7 @@
                 <w:color w:val="000000"/>
                 <w:lang w:eastAsia="zh-HK"/>
               </w:rPr>
-              <w:t>Judy Chu</w:t>
+              <w:t>Natalie Kwok</w:t>
             </w:r>
           </w:p>
         </w:tc>
@@ -4680,7 +4680,7 @@
                 <w:color w:val="000000"/>
                 <w:lang w:eastAsia="zh-HK"/>
               </w:rPr>
-              <w:t>特別費率按人頭計薪</w:t>
+              <w:t>專科班按人頭；私人課程一對一固定 $350／節</w:t>
             </w:r>
           </w:p>
         </w:tc>
@@ -4740,7 +4740,7 @@
                 <w:color w:val="000000"/>
                 <w:lang w:eastAsia="zh-HK"/>
               </w:rPr>
-              <w:t>Jackson Lau（Sum）</w:t>
+              <w:t>Judy Chu</w:t>
             </w:r>
           </w:p>
         </w:tc>
@@ -4769,7 +4769,7 @@
                 <w:color w:val="000000"/>
                 <w:lang w:eastAsia="zh-HK"/>
               </w:rPr>
-              <w:t>專科老師</w:t>
+              <w:t>兼職專科老師</w:t>
             </w:r>
           </w:p>
         </w:tc>
@@ -4798,7 +4798,7 @@
                 <w:color w:val="000000"/>
                 <w:lang w:eastAsia="zh-HK"/>
               </w:rPr>
-              <w:t>獨立定價</w:t>
+              <w:t>特別費率按人頭計薪</w:t>
             </w:r>
           </w:p>
         </w:tc>
@@ -4858,7 +4858,7 @@
                 <w:color w:val="000000"/>
                 <w:lang w:eastAsia="zh-HK"/>
               </w:rPr>
-              <w:t>Cyndi Ng</w:t>
+              <w:t>Jackson Lau（Sum）</w:t>
             </w:r>
           </w:p>
         </w:tc>
@@ -4916,7 +4916,7 @@
                 <w:color w:val="000000"/>
                 <w:lang w:eastAsia="zh-HK"/>
               </w:rPr>
-              <w:t>獨立定價（專科班按學費 50%）</w:t>
+              <w:t>獨立定價</w:t>
             </w:r>
           </w:p>
         </w:tc>
@@ -4976,6 +4976,124 @@
                 <w:color w:val="000000"/>
                 <w:lang w:eastAsia="zh-HK"/>
               </w:rPr>
+              <w:t>Cyndi Ng</w:t>
+            </w:r>
+          </w:p>
+        </w:tc>
+        <w:tc>
+          <w:tcPr>
+            <w:tcW w:type="dxa" w:w="2268"/>
+            <w:tcBorders>
+              <w:top w:val="single" w:sz="4" w:color="000000" w:space="0"/>
+              <w:left w:val="single" w:sz="4" w:color="000000" w:space="0"/>
+              <w:bottom w:val="single" w:sz="4" w:color="000000" w:space="0"/>
+              <w:right w:val="single" w:sz="4" w:color="000000" w:space="0"/>
+            </w:tcBorders>
+          </w:tcPr>
+          <w:p>
+            <w:pPr>
+              <w:spacing w:before="0" w:after="0" w:line="288" w:lineRule="auto"/>
+            </w:pPr>
+            <w:r/>
+            <w:r>
+              <w:rPr>
+                <w:rFonts w:ascii="新細明體" w:hAnsi="新細明體" w:eastAsia="新細明體"/>
+                <w:b w:val="0"/>
+                <w:i w:val="0"/>
+                <w:color w:val="000000"/>
+                <w:sz w:val="20"/>
+                <w:color w:val="000000"/>
+                <w:lang w:eastAsia="zh-HK"/>
+              </w:rPr>
+              <w:t>專科老師</w:t>
+            </w:r>
+          </w:p>
+        </w:tc>
+        <w:tc>
+          <w:tcPr>
+            <w:tcW w:type="dxa" w:w="2268"/>
+            <w:tcBorders>
+              <w:top w:val="single" w:sz="4" w:color="000000" w:space="0"/>
+              <w:left w:val="single" w:sz="4" w:color="000000" w:space="0"/>
+              <w:bottom w:val="single" w:sz="4" w:color="000000" w:space="0"/>
+              <w:right w:val="single" w:sz="4" w:color="000000" w:space="0"/>
+            </w:tcBorders>
+          </w:tcPr>
+          <w:p>
+            <w:pPr>
+              <w:spacing w:before="0" w:after="0" w:line="288" w:lineRule="auto"/>
+            </w:pPr>
+            <w:r/>
+            <w:r>
+              <w:rPr>
+                <w:rFonts w:ascii="新細明體" w:hAnsi="新細明體" w:eastAsia="新細明體"/>
+                <w:b w:val="0"/>
+                <w:i w:val="0"/>
+                <w:color w:val="000000"/>
+                <w:sz w:val="20"/>
+                <w:color w:val="000000"/>
+                <w:lang w:eastAsia="zh-HK"/>
+              </w:rPr>
+              <w:t>獨立定價（專科班按學費 50%）</w:t>
+            </w:r>
+          </w:p>
+        </w:tc>
+        <w:tc>
+          <w:tcPr>
+            <w:tcW w:type="dxa" w:w="2268"/>
+            <w:tcBorders>
+              <w:top w:val="single" w:sz="4" w:color="000000" w:space="0"/>
+              <w:left w:val="single" w:sz="4" w:color="000000" w:space="0"/>
+              <w:bottom w:val="single" w:sz="4" w:color="000000" w:space="0"/>
+              <w:right w:val="single" w:sz="4" w:color="000000" w:space="0"/>
+            </w:tcBorders>
+          </w:tcPr>
+          <w:p>
+            <w:pPr>
+              <w:spacing w:before="0" w:after="0" w:line="288" w:lineRule="auto"/>
+            </w:pPr>
+            <w:r/>
+            <w:r>
+              <w:rPr>
+                <w:rFonts w:ascii="新細明體" w:hAnsi="新細明體" w:eastAsia="新細明體"/>
+                <w:b w:val="0"/>
+                <w:i w:val="0"/>
+                <w:color w:val="000000"/>
+                <w:sz w:val="20"/>
+                <w:color w:val="000000"/>
+                <w:lang w:eastAsia="zh-HK"/>
+              </w:rPr>
+              <w:t>否</w:t>
+            </w:r>
+          </w:p>
+        </w:tc>
+      </w:tr>
+      <w:tr>
+        <w:tc>
+          <w:tcPr>
+            <w:tcW w:type="dxa" w:w="2268"/>
+            <w:tcBorders>
+              <w:top w:val="single" w:sz="4" w:color="000000" w:space="0"/>
+              <w:left w:val="single" w:sz="4" w:color="000000" w:space="0"/>
+              <w:bottom w:val="single" w:sz="4" w:color="000000" w:space="0"/>
+              <w:right w:val="single" w:sz="4" w:color="000000" w:space="0"/>
+            </w:tcBorders>
+          </w:tcPr>
+          <w:p>
+            <w:pPr>
+              <w:spacing w:before="0" w:after="0" w:line="288" w:lineRule="auto"/>
+            </w:pPr>
+            <w:r/>
+            <w:r>
+              <w:rPr>
+                <w:rFonts w:ascii="新細明體" w:hAnsi="新細明體" w:eastAsia="新細明體"/>
+                <w:b w:val="0"/>
+                <w:i w:val="0"/>
+                <w:color w:val="000000"/>
+                <w:sz w:val="20"/>
+                <w:color w:val="000000"/>
+                <w:lang w:eastAsia="zh-HK"/>
+              </w:rPr>
               <w:t>Cody Cheong</w:t>
             </w:r>
           </w:p>
@@ -5088,7 +5206,7 @@
           <w:color w:val="000000"/>
           <w:lang w:eastAsia="zh-HK"/>
         </w:rPr>
-        <w:t>說明：同一同事若同時有多於一種工作（例如 Leo Chan 兼專科與其他工作），各部分獨立計算後加總。功輔班部分見第 16 章。</w:t>
+        <w:t>說明：同一同事若同時有多於一種工作（例如 Leo Chan 兼專科與功輔），各部分獨立計算後加總。功輔班部分見第 16 章。</w:t>
       </w:r>
     </w:p>
     <w:p>
@@ -6332,7 +6450,7 @@
           <w:color w:val="000000"/>
           <w:lang w:eastAsia="zh-HK"/>
         </w:rPr>
-        <w:t>功輔班佣金現階段不納入本指南的每月計算，見第 16 章。</w:t>
+        <w:t>功輔班佣金見第 16 章：與中國語文分成佣金分開計算。</w:t>
       </w:r>
     </w:p>
     <w:p>
@@ -7061,7 +7179,7 @@
           <w:color w:val="000000"/>
           <w:lang w:eastAsia="zh-HK"/>
         </w:rPr>
-        <w:t>（Judy Chu 見第 8 章；其費率不同。Natalie Kwok 的專科班按本章；私人課程一對一見第 7.5 節。）</w:t>
+        <w:t>（Judy Chu 見第 8 章；其費率不同。Elaine Yao 見第 7.6 節；初中人頭獎不同。Natalie Kwok 的專科班按本章；私人課程一對一見第 7.5 節。）</w:t>
       </w:r>
     </w:p>
     <w:p>
@@ -8134,7 +8252,7 @@
           <w:color w:val="000000"/>
           <w:lang w:eastAsia="zh-HK"/>
         </w:rPr>
-        <w:t xml:space="preserve"> 計糧引擎現時仍把一般兼職一對一當成等效 3 人頭。出糧前須核對 Natalie Kwok 的一對一明細；若系統仍顯示 $240 或 $290，應按本節改為 $350／節（人手調整，見第 15 章），直至費率已在系統覆寫。</w:t>
+        <w:t xml:space="preserve"> 一般兼職一對一仍按等效 3 人頭。Natalie Kwok 的費率已覆寫為一對一固定 $350／節；其專科班仍按第 7.2 節人頭。未結算月份須按「重算」才會更新畫面。</w:t>
       </w:r>
     </w:p>
     <w:p>
@@ -8152,6 +8270,167 @@
           <w:lang w:eastAsia="zh-HK"/>
         </w:rPr>
         <w:t>2026-07 已結算後補正：3 節由 $240 改 $350（+$330）；實際已補發。糧單快照與成本帳已一併改正。</w:t>
+      </w:r>
+    </w:p>
+    <w:p>
+      <w:pPr>
+        <w:pStyle w:val="Heading2"/>
+        <w:spacing w:before="280" w:after="160" w:line="288" w:lineRule="auto"/>
+      </w:pPr>
+      <w:r>
+        <w:rPr>
+          <w:rFonts w:ascii="新細明體" w:hAnsi="新細明體" w:eastAsia="新細明體"/>
+          <w:b/>
+          <w:i w:val="0"/>
+          <w:color w:val="000000"/>
+          <w:sz w:val="24"/>
+          <w:color w:val="000000"/>
+          <w:lang w:eastAsia="zh-HK"/>
+        </w:rPr>
+        <w:t>7.6 Elaine Yao：初中人頭獎不同</w:t>
+      </w:r>
+    </w:p>
+    <w:p>
+      <w:pPr>
+        <w:spacing w:after="160" w:line="324" w:lineRule="auto"/>
+      </w:pPr>
+      <w:r>
+        <w:rPr>
+          <w:rFonts w:ascii="新細明體" w:hAnsi="新細明體" w:eastAsia="新細明體"/>
+          <w:b w:val="0"/>
+          <w:i w:val="0"/>
+          <w:color w:val="000000"/>
+          <w:sz w:val="22"/>
+          <w:color w:val="000000"/>
+          <w:lang w:eastAsia="zh-HK"/>
+        </w:rPr>
+        <w:t>Elaine Yao 適用兼職專科班規則，但</w:t>
+      </w:r>
+      <w:r>
+        <w:rPr>
+          <w:rFonts w:ascii="新細明體" w:hAnsi="新細明體" w:eastAsia="新細明體"/>
+          <w:b/>
+          <w:i w:val="0"/>
+          <w:color w:val="000000"/>
+          <w:sz w:val="22"/>
+          <w:color w:val="000000"/>
+          <w:lang w:eastAsia="zh-HK"/>
+        </w:rPr>
+        <w:t>初中</w:t>
+      </w:r>
+      <w:r>
+        <w:rPr>
+          <w:rFonts w:ascii="新細明體" w:hAnsi="新細明體" w:eastAsia="新細明體"/>
+          <w:b w:val="0"/>
+          <w:i w:val="0"/>
+          <w:color w:val="000000"/>
+          <w:sz w:val="22"/>
+          <w:color w:val="000000"/>
+          <w:lang w:eastAsia="zh-HK"/>
+        </w:rPr>
+        <w:t>其後每人頭為 +$50（一般兼職為 +$60）。高中與一般兼職相同。合約生效日 2026-09-13；系統費率自 2026-09-01 起生效（涵蓋 9 月計糧）。</w:t>
+      </w:r>
+    </w:p>
+    <w:p>
+      <w:pPr>
+        <w:spacing w:after="160" w:line="324" w:lineRule="auto"/>
+      </w:pPr>
+      <w:r>
+        <w:rPr>
+          <w:rFonts w:ascii="新細明體" w:hAnsi="新細明體" w:eastAsia="新細明體"/>
+          <w:b w:val="0"/>
+          <w:i w:val="0"/>
+          <w:color w:val="000000"/>
+          <w:sz w:val="22"/>
+          <w:color w:val="000000"/>
+          <w:lang w:eastAsia="zh-HK"/>
+        </w:rPr>
+        <w:t>初中（中一至中三）：</w:t>
+      </w:r>
+    </w:p>
+    <w:p>
+      <w:pPr>
+        <w:spacing w:after="200" w:line="324" w:lineRule="auto"/>
+      </w:pPr>
+      <w:r>
+        <w:rPr>
+          <w:rFonts w:ascii="新細明體" w:hAnsi="新細明體" w:eastAsia="新細明體"/>
+          <w:b w:val="0"/>
+          <w:i w:val="0"/>
+          <w:color w:val="000000"/>
+          <w:sz w:val="21"/>
+          <w:color w:val="000000"/>
+          <w:lang w:eastAsia="zh-HK"/>
+        </w:rPr>
+        <w:t>每節薪酬 = $120 ＋ $50 ×（實際扣堂人頭 − 1）</w:t>
+      </w:r>
+    </w:p>
+    <w:p>
+      <w:pPr>
+        <w:spacing w:after="160" w:line="324" w:lineRule="auto"/>
+      </w:pPr>
+      <w:r>
+        <w:rPr>
+          <w:rFonts w:ascii="新細明體" w:hAnsi="新細明體" w:eastAsia="新細明體"/>
+          <w:b w:val="0"/>
+          <w:i w:val="0"/>
+          <w:color w:val="000000"/>
+          <w:sz w:val="22"/>
+          <w:color w:val="000000"/>
+          <w:lang w:eastAsia="zh-HK"/>
+        </w:rPr>
+        <w:t>高中（中四至中六）：</w:t>
+      </w:r>
+    </w:p>
+    <w:p>
+      <w:pPr>
+        <w:spacing w:after="200" w:line="324" w:lineRule="auto"/>
+      </w:pPr>
+      <w:r>
+        <w:rPr>
+          <w:rFonts w:ascii="新細明體" w:hAnsi="新細明體" w:eastAsia="新細明體"/>
+          <w:b w:val="0"/>
+          <w:i w:val="0"/>
+          <w:color w:val="000000"/>
+          <w:sz w:val="21"/>
+          <w:color w:val="000000"/>
+          <w:lang w:eastAsia="zh-HK"/>
+        </w:rPr>
+        <w:t>每節薪酬 = $150 ＋ $70 ×（實際扣堂人頭 − 1）</w:t>
+      </w:r>
+    </w:p>
+    <w:p>
+      <w:pPr>
+        <w:spacing w:after="160" w:line="324" w:lineRule="auto"/>
+      </w:pPr>
+      <w:r>
+        <w:rPr>
+          <w:rFonts w:ascii="新細明體" w:hAnsi="新細明體" w:eastAsia="新細明體"/>
+          <w:b w:val="0"/>
+          <w:i w:val="0"/>
+          <w:color w:val="000000"/>
+          <w:sz w:val="22"/>
+          <w:color w:val="000000"/>
+          <w:lang w:eastAsia="zh-HK"/>
+        </w:rPr>
+        <w:t>一對一／一對二仍按第 7.3 節等效 3／4 人頭，但初中用上表 +$50。</w:t>
+      </w:r>
+    </w:p>
+    <w:p>
+      <w:pPr>
+        <w:spacing w:after="160" w:line="324" w:lineRule="auto"/>
+      </w:pPr>
+      <w:r>
+        <w:rPr>
+          <w:rFonts w:ascii="新細明體" w:hAnsi="新細明體" w:eastAsia="新細明體"/>
+          <w:b w:val="0"/>
+          <w:i w:val="0"/>
+          <w:color w:val="000000"/>
+          <w:sz w:val="22"/>
+          <w:color w:val="000000"/>
+          <w:lang w:eastAsia="zh-HK"/>
+        </w:rPr>
+        <w:t>另有初中功輔時薪 $100／小時（見第 16.1 節）。</w:t>
       </w:r>
     </w:p>
     <w:p>
@@ -9267,7 +9546,7 @@
           <w:color w:val="000000"/>
           <w:lang w:eastAsia="zh-HK"/>
         </w:rPr>
-        <w:t>：兼職專科班人頭薪酬 ＋（如有）其他已核准項目</w:t>
+        <w:t>：兼職專科班人頭薪酬 ＋ 功輔時薪（見第 16 章）</w:t>
       </w:r>
     </w:p>
     <w:p>
@@ -9309,7 +9588,7 @@
           <w:color w:val="000000"/>
           <w:lang w:eastAsia="zh-HK"/>
         </w:rPr>
-        <w:t>：特別費率專科班薪酬 ＋（如有）其他已核准項目</w:t>
+        <w:t>：特別費率專科班薪酬 ＋ 功輔時薪（見第 16 章）</w:t>
       </w:r>
     </w:p>
     <w:p>
@@ -9356,6 +9635,48 @@
     </w:p>
     <w:p>
       <w:pPr>
+        <w:spacing w:before="20" w:after="80" w:line="324" w:lineRule="auto"/>
+        <w:ind w:left="425" w:hanging="227"/>
+      </w:pPr>
+      <w:r>
+        <w:rPr>
+          <w:rFonts w:ascii="新細明體" w:hAnsi="新細明體" w:eastAsia="新細明體"/>
+          <w:b w:val="0"/>
+          <w:i w:val="0"/>
+          <w:color w:val="000000"/>
+          <w:sz w:val="22"/>
+          <w:color w:val="000000"/>
+          <w:lang w:eastAsia="zh-HK"/>
+        </w:rPr>
+        <w:t xml:space="preserve">• </w:t>
+      </w:r>
+      <w:r>
+        <w:rPr>
+          <w:rFonts w:ascii="新細明體" w:hAnsi="新細明體" w:eastAsia="新細明體"/>
+          <w:b/>
+          <w:i w:val="0"/>
+          <w:color w:val="000000"/>
+          <w:sz w:val="22"/>
+          <w:color w:val="000000"/>
+          <w:lang w:eastAsia="zh-HK"/>
+        </w:rPr>
+        <w:t>Christine Fan</w:t>
+      </w:r>
+      <w:r>
+        <w:rPr>
+          <w:rFonts w:ascii="新細明體" w:hAnsi="新細明體" w:eastAsia="新細明體"/>
+          <w:b w:val="0"/>
+          <w:i w:val="0"/>
+          <w:color w:val="000000"/>
+          <w:sz w:val="22"/>
+          <w:color w:val="000000"/>
+          <w:lang w:eastAsia="zh-HK"/>
+        </w:rPr>
+        <w:t>：專科分成 ＋ 功輔時薪 ＋ 功輔佣金（見第 16 章）</w:t>
+      </w:r>
+    </w:p>
+    <w:p>
+      <w:pPr>
         <w:spacing w:after="160" w:line="324" w:lineRule="auto"/>
       </w:pPr>
       <w:r>
@@ -9368,7 +9689,7 @@
           <w:color w:val="000000"/>
           <w:lang w:eastAsia="zh-HK"/>
         </w:rPr>
-        <w:t>功輔班時薪現階段不納入每月自動計算，見第 16 章。</w:t>
+        <w:t>功輔時薪與佣金已納入每月計糧，見第 16 章。</w:t>
       </w:r>
     </w:p>
     <w:p>
@@ -11082,7 +11403,7 @@
           <w:color w:val="000000"/>
           <w:lang w:eastAsia="zh-HK"/>
         </w:rPr>
-        <w:t>未點名：可發送點名提醒（老師收件匣）並標「已請補點、等重算」，或排除該人後提交其餘。財務不可代為點名。要看點名紙或改資料時，才用「查證」開排程詳情／出席紀錄。</w:t>
+        <w:t>未點名：可發送點名提醒（老師收件匣）並標「已請補點、等重算」，或排除該人後提交其餘。財務不可代為點名。要看點名紙或改資料時，才用「查證」開排程詳情／出席紀錄。頁面顯示上次計算，剛補點名或改排程後請先按「重算」再核對。</w:t>
       </w:r>
     </w:p>
     <w:p>
@@ -12516,7 +12837,7 @@
                 <w:color w:val="000000"/>
                 <w:lang w:eastAsia="zh-HK"/>
               </w:rPr>
-              <w:t>按第 7.5 節改為 $350／節；學費 $650／$825 不影響人工</w:t>
+              <w:t>先按「重算」。若仍錯，暫按第 7.5 節人手改為 $350／節並回報；學費 $650／$825 不影響人工</w:t>
             </w:r>
           </w:p>
         </w:tc>
@@ -12550,7 +12871,7 @@
           <w:color w:val="000000"/>
           <w:lang w:eastAsia="zh-HK"/>
         </w:rPr>
-        <w:t>16. 暫不納入本指南的項目</w:t>
+        <w:t>16. 功課輔導班時薪與 Christine 功輔佣金</w:t>
       </w:r>
     </w:p>
     <w:p>
@@ -12567,35 +12888,46 @@
           <w:color w:val="000000"/>
           <w:lang w:eastAsia="zh-HK"/>
         </w:rPr>
-        <w:t>下列項目現階段</w:t>
-      </w:r>
-      <w:r>
-        <w:rPr>
-          <w:rFonts w:ascii="新細明體" w:hAnsi="新細明體" w:eastAsia="新細明體"/>
-          <w:b/>
-          <w:i w:val="0"/>
-          <w:color w:val="000000"/>
-          <w:sz w:val="22"/>
-          <w:color w:val="000000"/>
-          <w:lang w:eastAsia="zh-HK"/>
-        </w:rPr>
-        <w:t>不納入每月計糧</w:t>
-      </w:r>
-      <w:r>
-        <w:rPr>
-          <w:rFonts w:ascii="新細明體" w:hAnsi="新細明體" w:eastAsia="新細明體"/>
-          <w:b w:val="0"/>
-          <w:i w:val="0"/>
-          <w:color w:val="000000"/>
-          <w:sz w:val="22"/>
-          <w:color w:val="000000"/>
-          <w:lang w:eastAsia="zh-HK"/>
-        </w:rPr>
-        <w:t>：</w:t>
+        <w:t>功課輔導班薪酬與專科班分開計算，再加總到同一同事該月總薪酬。</w:t>
       </w:r>
     </w:p>
     <w:p>
       <w:pPr>
+        <w:pStyle w:val="Heading2"/>
+        <w:spacing w:before="280" w:after="160" w:line="288" w:lineRule="auto"/>
+      </w:pPr>
+      <w:r>
+        <w:rPr>
+          <w:rFonts w:ascii="新細明體" w:hAnsi="新細明體" w:eastAsia="新細明體"/>
+          <w:b/>
+          <w:i w:val="0"/>
+          <w:color w:val="000000"/>
+          <w:sz w:val="24"/>
+          <w:color w:val="000000"/>
+          <w:lang w:eastAsia="zh-HK"/>
+        </w:rPr>
+        <w:t>16.1 時薪</w:t>
+      </w:r>
+    </w:p>
+    <w:p>
+      <w:pPr>
+        <w:spacing w:after="160" w:line="324" w:lineRule="auto"/>
+      </w:pPr>
+      <w:r>
+        <w:rPr>
+          <w:rFonts w:ascii="新細明體" w:hAnsi="新細明體" w:eastAsia="新細明體"/>
+          <w:b w:val="0"/>
+          <w:i w:val="0"/>
+          <w:color w:val="000000"/>
+          <w:sz w:val="22"/>
+          <w:color w:val="000000"/>
+          <w:lang w:eastAsia="zh-HK"/>
+        </w:rPr>
+        <w:t>導師按已發布月工作表當值時段計工時（該日各人上班至下班）。財務可在計糧時修正合計工時。</w:t>
+      </w:r>
+    </w:p>
+    <w:p>
+      <w:pPr>
         <w:spacing w:before="20" w:after="80" w:line="324" w:lineRule="auto"/>
         <w:ind w:left="425" w:hanging="227"/>
       </w:pPr>
@@ -12609,7 +12941,19 @@
           <w:color w:val="000000"/>
           <w:lang w:eastAsia="zh-HK"/>
         </w:rPr>
-        <w:t xml:space="preserve">1. </w:t>
+        <w:t xml:space="preserve">• </w:t>
+      </w:r>
+      <w:r>
+        <w:rPr>
+          <w:rFonts w:ascii="新細明體" w:hAnsi="新細明體" w:eastAsia="新細明體"/>
+          <w:b w:val="0"/>
+          <w:i w:val="0"/>
+          <w:color w:val="000000"/>
+          <w:sz w:val="22"/>
+          <w:color w:val="000000"/>
+          <w:lang w:eastAsia="zh-HK"/>
+        </w:rPr>
+        <w:t>功輔校曆放假日、惡劣天氣停課當日：</w:t>
       </w:r>
       <w:r>
         <w:rPr>
@@ -12621,12 +12965,25 @@
           <w:color w:val="000000"/>
           <w:lang w:eastAsia="zh-HK"/>
         </w:rPr>
-        <w:t>功輔班時薪</w:t>
+        <w:t>不計工時</w:t>
+      </w:r>
+      <w:r>
+        <w:rPr>
+          <w:rFonts w:ascii="新細明體" w:hAnsi="新細明體" w:eastAsia="新細明體"/>
+          <w:b w:val="0"/>
+          <w:i w:val="0"/>
+          <w:color w:val="000000"/>
+          <w:sz w:val="22"/>
+          <w:color w:val="000000"/>
+          <w:lang w:eastAsia="zh-HK"/>
+        </w:rPr>
+        <w:t>（即使當日曾編更）。</w:t>
       </w:r>
     </w:p>
     <w:p>
       <w:pPr>
-        <w:spacing w:after="160" w:line="324" w:lineRule="auto"/>
+        <w:spacing w:before="20" w:after="80" w:line="324" w:lineRule="auto"/>
+        <w:ind w:left="425" w:hanging="227"/>
       </w:pPr>
       <w:r>
         <w:rPr>
@@ -12638,7 +12995,19 @@
           <w:color w:val="000000"/>
           <w:lang w:eastAsia="zh-HK"/>
         </w:rPr>
-        <w:t>功輔班尚未全面開辦，相關計法將於正式開辦後另行公佈。</w:t>
+        <w:t xml:space="preserve">• </w:t>
+      </w:r>
+      <w:r>
+        <w:rPr>
+          <w:rFonts w:ascii="新細明體" w:hAnsi="新細明體" w:eastAsia="新細明體"/>
+          <w:b w:val="0"/>
+          <w:i w:val="0"/>
+          <w:color w:val="000000"/>
+          <w:sz w:val="22"/>
+          <w:color w:val="000000"/>
+          <w:lang w:eastAsia="zh-HK"/>
+        </w:rPr>
+        <w:t>無每日補 $50，亦無試用首月 $80。</w:t>
       </w:r>
     </w:p>
     <w:p>
@@ -12656,7 +13025,7 @@
           <w:color w:val="000000"/>
           <w:lang w:eastAsia="zh-HK"/>
         </w:rPr>
-        <w:t xml:space="preserve">2. </w:t>
+        <w:t xml:space="preserve">• </w:t>
       </w:r>
       <w:r>
         <w:rPr>
@@ -12668,12 +13037,25 @@
           <w:color w:val="000000"/>
           <w:lang w:eastAsia="zh-HK"/>
         </w:rPr>
-        <w:t>Christine Fan 的功輔班佣金</w:t>
+        <w:t>Katie Lee</w:t>
+      </w:r>
+      <w:r>
+        <w:rPr>
+          <w:rFonts w:ascii="新細明體" w:hAnsi="新細明體" w:eastAsia="新細明體"/>
+          <w:b w:val="0"/>
+          <w:i w:val="0"/>
+          <w:color w:val="000000"/>
+          <w:sz w:val="22"/>
+          <w:color w:val="000000"/>
+          <w:lang w:eastAsia="zh-HK"/>
+        </w:rPr>
+        <w:t xml:space="preserve"> 可編更，但不用功輔時薪（固定月薪另計）。</w:t>
       </w:r>
     </w:p>
     <w:p>
       <w:pPr>
-        <w:spacing w:after="160" w:line="324" w:lineRule="auto"/>
+        <w:spacing w:before="20" w:after="80" w:line="324" w:lineRule="auto"/>
+        <w:ind w:left="425" w:hanging="227"/>
       </w:pPr>
       <w:r>
         <w:rPr>
@@ -12685,8 +13067,337 @@
           <w:color w:val="000000"/>
           <w:lang w:eastAsia="zh-HK"/>
         </w:rPr>
-        <w:t>日後原則為：當月功輔班報讀人數達 12 人或以上，方可計算功輔班佣金。詳細基數與操作，待功輔班安排確定後另文公布。</w:t>
-      </w:r>
+        <w:t xml:space="preserve">• </w:t>
+      </w:r>
+      <w:r>
+        <w:rPr>
+          <w:rFonts w:ascii="新細明體" w:hAnsi="新細明體" w:eastAsia="新細明體"/>
+          <w:b w:val="0"/>
+          <w:i w:val="0"/>
+          <w:color w:val="000000"/>
+          <w:sz w:val="22"/>
+          <w:color w:val="000000"/>
+          <w:lang w:eastAsia="zh-HK"/>
+        </w:rPr>
+        <w:t>Cheryl Ng、Henry Wong、Phoebe Tam 只做專科，不入功輔時薪名單。</w:t>
+      </w:r>
+    </w:p>
+    <w:tbl>
+      <w:tblPr>
+        <w:tblStyle w:val="TableGrid"/>
+        <w:tblW w:type="auto" w:w="0"/>
+        <w:tblLayout w:type="autofit"/>
+        <w:tblLook w:firstColumn="1" w:firstRow="1" w:lastColumn="0" w:lastRow="0" w:noHBand="0" w:noVBand="1" w:val="04A0"/>
+      </w:tblPr>
+      <w:tblGrid>
+        <w:gridCol w:w="4536"/>
+        <w:gridCol w:w="4536"/>
+      </w:tblGrid>
+      <w:tr>
+        <w:tc>
+          <w:tcPr>
+            <w:tcW w:type="dxa" w:w="4536"/>
+            <w:tcBorders>
+              <w:top w:val="single" w:sz="4" w:color="000000" w:space="0"/>
+              <w:left w:val="single" w:sz="4" w:color="000000" w:space="0"/>
+              <w:bottom w:val="single" w:sz="4" w:color="000000" w:space="0"/>
+              <w:right w:val="single" w:sz="4" w:color="000000" w:space="0"/>
+            </w:tcBorders>
+          </w:tcPr>
+          <w:p>
+            <w:pPr>
+              <w:spacing w:before="0" w:after="0" w:line="288" w:lineRule="auto"/>
+            </w:pPr>
+            <w:r/>
+            <w:r>
+              <w:rPr>
+                <w:rFonts w:ascii="新細明體" w:hAnsi="新細明體" w:eastAsia="新細明體"/>
+                <w:b/>
+                <w:i w:val="0"/>
+                <w:color w:val="000000"/>
+                <w:sz w:val="20"/>
+                <w:color w:val="000000"/>
+                <w:lang w:eastAsia="zh-HK"/>
+              </w:rPr>
+              <w:t>時薪</w:t>
+            </w:r>
+          </w:p>
+        </w:tc>
+        <w:tc>
+          <w:tcPr>
+            <w:tcW w:type="dxa" w:w="4536"/>
+            <w:tcBorders>
+              <w:top w:val="single" w:sz="4" w:color="000000" w:space="0"/>
+              <w:left w:val="single" w:sz="4" w:color="000000" w:space="0"/>
+              <w:bottom w:val="single" w:sz="4" w:color="000000" w:space="0"/>
+              <w:right w:val="single" w:sz="4" w:color="000000" w:space="0"/>
+            </w:tcBorders>
+          </w:tcPr>
+          <w:p>
+            <w:pPr>
+              <w:spacing w:before="0" w:after="0" w:line="288" w:lineRule="auto"/>
+            </w:pPr>
+            <w:r/>
+            <w:r>
+              <w:rPr>
+                <w:rFonts w:ascii="新細明體" w:hAnsi="新細明體" w:eastAsia="新細明體"/>
+                <w:b/>
+                <w:i w:val="0"/>
+                <w:color w:val="000000"/>
+                <w:sz w:val="20"/>
+                <w:color w:val="000000"/>
+                <w:lang w:eastAsia="zh-HK"/>
+              </w:rPr>
+              <w:t>同事</w:t>
+            </w:r>
+          </w:p>
+        </w:tc>
+      </w:tr>
+      <w:tr>
+        <w:tc>
+          <w:tcPr>
+            <w:tcW w:type="dxa" w:w="4536"/>
+            <w:tcBorders>
+              <w:top w:val="single" w:sz="4" w:color="000000" w:space="0"/>
+              <w:left w:val="single" w:sz="4" w:color="000000" w:space="0"/>
+              <w:bottom w:val="single" w:sz="4" w:color="000000" w:space="0"/>
+              <w:right w:val="single" w:sz="4" w:color="000000" w:space="0"/>
+            </w:tcBorders>
+          </w:tcPr>
+          <w:p>
+            <w:pPr>
+              <w:spacing w:before="0" w:after="0" w:line="288" w:lineRule="auto"/>
+            </w:pPr>
+            <w:r/>
+            <w:r>
+              <w:rPr>
+                <w:rFonts w:ascii="新細明體" w:hAnsi="新細明體" w:eastAsia="新細明體"/>
+                <w:b w:val="0"/>
+                <w:i w:val="0"/>
+                <w:color w:val="000000"/>
+                <w:sz w:val="20"/>
+                <w:color w:val="000000"/>
+                <w:lang w:eastAsia="zh-HK"/>
+              </w:rPr>
+              <w:t>$70</w:t>
+            </w:r>
+          </w:p>
+        </w:tc>
+        <w:tc>
+          <w:tcPr>
+            <w:tcW w:type="dxa" w:w="4536"/>
+            <w:tcBorders>
+              <w:top w:val="single" w:sz="4" w:color="000000" w:space="0"/>
+              <w:left w:val="single" w:sz="4" w:color="000000" w:space="0"/>
+              <w:bottom w:val="single" w:sz="4" w:color="000000" w:space="0"/>
+              <w:right w:val="single" w:sz="4" w:color="000000" w:space="0"/>
+            </w:tcBorders>
+          </w:tcPr>
+          <w:p>
+            <w:pPr>
+              <w:spacing w:before="0" w:after="0" w:line="288" w:lineRule="auto"/>
+            </w:pPr>
+            <w:r/>
+            <w:r>
+              <w:rPr>
+                <w:rFonts w:ascii="新細明體" w:hAnsi="新細明體" w:eastAsia="新細明體"/>
+                <w:b w:val="0"/>
+                <w:i w:val="0"/>
+                <w:color w:val="000000"/>
+                <w:sz w:val="20"/>
+                <w:color w:val="000000"/>
+                <w:lang w:eastAsia="zh-HK"/>
+              </w:rPr>
+              <w:t>Jeffrey Lee、Ken Tam、Leo Chan</w:t>
+            </w:r>
+          </w:p>
+        </w:tc>
+      </w:tr>
+      <w:tr>
+        <w:tc>
+          <w:tcPr>
+            <w:tcW w:type="dxa" w:w="4536"/>
+            <w:tcBorders>
+              <w:top w:val="single" w:sz="4" w:color="000000" w:space="0"/>
+              <w:left w:val="single" w:sz="4" w:color="000000" w:space="0"/>
+              <w:bottom w:val="single" w:sz="4" w:color="000000" w:space="0"/>
+              <w:right w:val="single" w:sz="4" w:color="000000" w:space="0"/>
+            </w:tcBorders>
+          </w:tcPr>
+          <w:p>
+            <w:pPr>
+              <w:spacing w:before="0" w:after="0" w:line="288" w:lineRule="auto"/>
+            </w:pPr>
+            <w:r/>
+            <w:r>
+              <w:rPr>
+                <w:rFonts w:ascii="新細明體" w:hAnsi="新細明體" w:eastAsia="新細明體"/>
+                <w:b w:val="0"/>
+                <w:i w:val="0"/>
+                <w:color w:val="000000"/>
+                <w:sz w:val="20"/>
+                <w:color w:val="000000"/>
+                <w:lang w:eastAsia="zh-HK"/>
+              </w:rPr>
+              <w:t>$100</w:t>
+            </w:r>
+          </w:p>
+        </w:tc>
+        <w:tc>
+          <w:tcPr>
+            <w:tcW w:type="dxa" w:w="4536"/>
+            <w:tcBorders>
+              <w:top w:val="single" w:sz="4" w:color="000000" w:space="0"/>
+              <w:left w:val="single" w:sz="4" w:color="000000" w:space="0"/>
+              <w:bottom w:val="single" w:sz="4" w:color="000000" w:space="0"/>
+              <w:right w:val="single" w:sz="4" w:color="000000" w:space="0"/>
+            </w:tcBorders>
+          </w:tcPr>
+          <w:p>
+            <w:pPr>
+              <w:spacing w:before="0" w:after="0" w:line="288" w:lineRule="auto"/>
+            </w:pPr>
+            <w:r/>
+            <w:r>
+              <w:rPr>
+                <w:rFonts w:ascii="新細明體" w:hAnsi="新細明體" w:eastAsia="新細明體"/>
+                <w:b w:val="0"/>
+                <w:i w:val="0"/>
+                <w:color w:val="000000"/>
+                <w:sz w:val="20"/>
+                <w:color w:val="000000"/>
+                <w:lang w:eastAsia="zh-HK"/>
+              </w:rPr>
+              <w:t>Rain Kwok、Annie Leung、Erika Fok、Wing Chan、Liam Lai、Christine Fan、Kenneth Li、Elaine Yao</w:t>
+            </w:r>
+          </w:p>
+        </w:tc>
+      </w:tr>
+      <w:tr>
+        <w:tc>
+          <w:tcPr>
+            <w:tcW w:type="dxa" w:w="4536"/>
+            <w:tcBorders>
+              <w:top w:val="single" w:sz="4" w:color="000000" w:space="0"/>
+              <w:left w:val="single" w:sz="4" w:color="000000" w:space="0"/>
+              <w:bottom w:val="single" w:sz="4" w:color="000000" w:space="0"/>
+              <w:right w:val="single" w:sz="4" w:color="000000" w:space="0"/>
+            </w:tcBorders>
+          </w:tcPr>
+          <w:p>
+            <w:pPr>
+              <w:spacing w:before="0" w:after="0" w:line="288" w:lineRule="auto"/>
+            </w:pPr>
+            <w:r/>
+            <w:r>
+              <w:rPr>
+                <w:rFonts w:ascii="新細明體" w:hAnsi="新細明體" w:eastAsia="新細明體"/>
+                <w:b w:val="0"/>
+                <w:i w:val="0"/>
+                <w:color w:val="000000"/>
+                <w:sz w:val="20"/>
+                <w:color w:val="000000"/>
+                <w:lang w:eastAsia="zh-HK"/>
+              </w:rPr>
+              <w:t>$110</w:t>
+            </w:r>
+          </w:p>
+        </w:tc>
+        <w:tc>
+          <w:tcPr>
+            <w:tcW w:type="dxa" w:w="4536"/>
+            <w:tcBorders>
+              <w:top w:val="single" w:sz="4" w:color="000000" w:space="0"/>
+              <w:left w:val="single" w:sz="4" w:color="000000" w:space="0"/>
+              <w:bottom w:val="single" w:sz="4" w:color="000000" w:space="0"/>
+              <w:right w:val="single" w:sz="4" w:color="000000" w:space="0"/>
+            </w:tcBorders>
+          </w:tcPr>
+          <w:p>
+            <w:pPr>
+              <w:spacing w:before="0" w:after="0" w:line="288" w:lineRule="auto"/>
+            </w:pPr>
+            <w:r/>
+            <w:r>
+              <w:rPr>
+                <w:rFonts w:ascii="新細明體" w:hAnsi="新細明體" w:eastAsia="新細明體"/>
+                <w:b w:val="0"/>
+                <w:i w:val="0"/>
+                <w:color w:val="000000"/>
+                <w:sz w:val="20"/>
+                <w:color w:val="000000"/>
+                <w:lang w:eastAsia="zh-HK"/>
+              </w:rPr>
+              <w:t>Judy Chu</w:t>
+            </w:r>
+          </w:p>
+        </w:tc>
+      </w:tr>
+      <w:tr>
+        <w:tc>
+          <w:tcPr>
+            <w:tcW w:type="dxa" w:w="4536"/>
+            <w:tcBorders>
+              <w:top w:val="single" w:sz="4" w:color="000000" w:space="0"/>
+              <w:left w:val="single" w:sz="4" w:color="000000" w:space="0"/>
+              <w:bottom w:val="single" w:sz="4" w:color="000000" w:space="0"/>
+              <w:right w:val="single" w:sz="4" w:color="000000" w:space="0"/>
+            </w:tcBorders>
+          </w:tcPr>
+          <w:p>
+            <w:pPr>
+              <w:spacing w:before="0" w:after="0" w:line="288" w:lineRule="auto"/>
+            </w:pPr>
+            <w:r/>
+            <w:r>
+              <w:rPr>
+                <w:rFonts w:ascii="新細明體" w:hAnsi="新細明體" w:eastAsia="新細明體"/>
+                <w:b w:val="0"/>
+                <w:i w:val="0"/>
+                <w:color w:val="000000"/>
+                <w:sz w:val="20"/>
+                <w:color w:val="000000"/>
+                <w:lang w:eastAsia="zh-HK"/>
+              </w:rPr>
+              <w:t>$115</w:t>
+            </w:r>
+          </w:p>
+        </w:tc>
+        <w:tc>
+          <w:tcPr>
+            <w:tcW w:type="dxa" w:w="4536"/>
+            <w:tcBorders>
+              <w:top w:val="single" w:sz="4" w:color="000000" w:space="0"/>
+              <w:left w:val="single" w:sz="4" w:color="000000" w:space="0"/>
+              <w:bottom w:val="single" w:sz="4" w:color="000000" w:space="0"/>
+              <w:right w:val="single" w:sz="4" w:color="000000" w:space="0"/>
+            </w:tcBorders>
+          </w:tcPr>
+          <w:p>
+            <w:pPr>
+              <w:spacing w:before="0" w:after="0" w:line="288" w:lineRule="auto"/>
+            </w:pPr>
+            <w:r/>
+            <w:r>
+              <w:rPr>
+                <w:rFonts w:ascii="新細明體" w:hAnsi="新細明體" w:eastAsia="新細明體"/>
+                <w:b w:val="0"/>
+                <w:i w:val="0"/>
+                <w:color w:val="000000"/>
+                <w:sz w:val="20"/>
+                <w:color w:val="000000"/>
+                <w:lang w:eastAsia="zh-HK"/>
+              </w:rPr>
+              <w:t>Diana Kwok</w:t>
+            </w:r>
+          </w:p>
+        </w:tc>
+      </w:tr>
+    </w:tbl>
+    <w:p>
+      <w:pPr>
+        <w:spacing w:after="200"/>
+      </w:pPr>
     </w:p>
     <w:p>
       <w:pPr>
@@ -12702,7 +13413,107 @@
           <w:color w:val="000000"/>
           <w:lang w:eastAsia="zh-HK"/>
         </w:rPr>
-        <w:t>在另行公布前，每月出糧不計算上述兩項。</w:t>
+        <w:t>應發功輔時薪 = 該月工時 × 該同事時薪。</w:t>
+      </w:r>
+    </w:p>
+    <w:p>
+      <w:pPr>
+        <w:pStyle w:val="Heading2"/>
+        <w:spacing w:before="280" w:after="160" w:line="288" w:lineRule="auto"/>
+      </w:pPr>
+      <w:r>
+        <w:rPr>
+          <w:rFonts w:ascii="新細明體" w:hAnsi="新細明體" w:eastAsia="新細明體"/>
+          <w:b/>
+          <w:i w:val="0"/>
+          <w:color w:val="000000"/>
+          <w:sz w:val="24"/>
+          <w:color w:val="000000"/>
+          <w:lang w:eastAsia="zh-HK"/>
+        </w:rPr>
+        <w:t>16.2 Christine Fan 功輔佣金</w:t>
+      </w:r>
+    </w:p>
+    <w:p>
+      <w:pPr>
+        <w:spacing w:after="160" w:line="324" w:lineRule="auto"/>
+      </w:pPr>
+      <w:r>
+        <w:rPr>
+          <w:rFonts w:ascii="新細明體" w:hAnsi="新細明體" w:eastAsia="新細明體"/>
+          <w:b w:val="0"/>
+          <w:i w:val="0"/>
+          <w:color w:val="000000"/>
+          <w:sz w:val="22"/>
+          <w:color w:val="000000"/>
+          <w:lang w:eastAsia="zh-HK"/>
+        </w:rPr>
+        <w:t>當月功輔班</w:t>
+      </w:r>
+      <w:r>
+        <w:rPr>
+          <w:rFonts w:ascii="新細明體" w:hAnsi="新細明體" w:eastAsia="新細明體"/>
+          <w:b/>
+          <w:i w:val="0"/>
+          <w:color w:val="000000"/>
+          <w:sz w:val="22"/>
+          <w:color w:val="000000"/>
+          <w:lang w:eastAsia="zh-HK"/>
+        </w:rPr>
+        <w:t>報讀人數達 15 人或以上</w:t>
+      </w:r>
+      <w:r>
+        <w:rPr>
+          <w:rFonts w:ascii="新細明體" w:hAnsi="新細明體" w:eastAsia="新細明體"/>
+          <w:b w:val="0"/>
+          <w:i w:val="0"/>
+          <w:color w:val="000000"/>
+          <w:sz w:val="22"/>
+          <w:color w:val="000000"/>
+          <w:lang w:eastAsia="zh-HK"/>
+        </w:rPr>
+        <w:t>，方可計算佣金；少於 15 人則該月功輔佣金為 0。達門檻後，佣金為該月功輔班學費</w:t>
+      </w:r>
+      <w:r>
+        <w:rPr>
+          <w:rFonts w:ascii="新細明體" w:hAnsi="新細明體" w:eastAsia="新細明體"/>
+          <w:b/>
+          <w:i w:val="0"/>
+          <w:color w:val="000000"/>
+          <w:sz w:val="22"/>
+          <w:color w:val="000000"/>
+          <w:lang w:eastAsia="zh-HK"/>
+        </w:rPr>
+        <w:t>原價</w:t>
+      </w:r>
+      <w:r>
+        <w:rPr>
+          <w:rFonts w:ascii="新細明體" w:hAnsi="新細明體" w:eastAsia="新細明體"/>
+          <w:b w:val="0"/>
+          <w:i w:val="0"/>
+          <w:color w:val="000000"/>
+          <w:sz w:val="22"/>
+          <w:color w:val="000000"/>
+          <w:lang w:eastAsia="zh-HK"/>
+        </w:rPr>
+        <w:t>的 10%（不是只計算第 15 名學生起的學費）。舊稿「達 12 人」已作廢。編制期望總人數 ≥12 與本門檻無關。</w:t>
+      </w:r>
+    </w:p>
+    <w:p>
+      <w:pPr>
+        <w:spacing w:after="160" w:line="324" w:lineRule="auto"/>
+      </w:pPr>
+      <w:r>
+        <w:rPr>
+          <w:rFonts w:ascii="新細明體" w:hAnsi="新細明體" w:eastAsia="新細明體"/>
+          <w:b w:val="0"/>
+          <w:i w:val="0"/>
+          <w:color w:val="000000"/>
+          <w:sz w:val="22"/>
+          <w:color w:val="000000"/>
+          <w:lang w:eastAsia="zh-HK"/>
+        </w:rPr>
+        <w:t>Christine Fan 本人若當值，另取第 16.1 節時薪 $100；功輔佣金與專科中國語文佣金分開。</w:t>
       </w:r>
     </w:p>
     <w:p>
@@ -13736,11 +14547,52 @@
           <w:color w:val="000000"/>
           <w:lang w:eastAsia="zh-HK"/>
         </w:rPr>
-        <w:t>不用上表，見第 17.7 節。</w:t>
+        <w:t>不用上表，見第 17.8 節。</w:t>
       </w:r>
     </w:p>
     <w:p>
       <w:pPr>
+        <w:spacing w:after="160" w:line="324" w:lineRule="auto"/>
+      </w:pPr>
+      <w:r>
+        <w:rPr>
+          <w:rFonts w:ascii="新細明體" w:hAnsi="新細明體" w:eastAsia="新細明體"/>
+          <w:b w:val="0"/>
+          <w:i w:val="0"/>
+          <w:color w:val="000000"/>
+          <w:sz w:val="22"/>
+          <w:color w:val="000000"/>
+          <w:lang w:eastAsia="zh-HK"/>
+        </w:rPr>
+        <w:t xml:space="preserve">Elaine Yao </w:t>
+      </w:r>
+      <w:r>
+        <w:rPr>
+          <w:rFonts w:ascii="新細明體" w:hAnsi="新細明體" w:eastAsia="新細明體"/>
+          <w:b/>
+          <w:i w:val="0"/>
+          <w:color w:val="000000"/>
+          <w:sz w:val="22"/>
+          <w:color w:val="000000"/>
+          <w:lang w:eastAsia="zh-HK"/>
+        </w:rPr>
+        <w:t>不用</w:t>
+      </w:r>
+      <w:r>
+        <w:rPr>
+          <w:rFonts w:ascii="新細明體" w:hAnsi="新細明體" w:eastAsia="新細明體"/>
+          <w:b w:val="0"/>
+          <w:i w:val="0"/>
+          <w:color w:val="000000"/>
+          <w:sz w:val="22"/>
+          <w:color w:val="000000"/>
+          <w:lang w:eastAsia="zh-HK"/>
+        </w:rPr>
+        <w:t>上表初中欄；見第 17.4 節。</w:t>
+      </w:r>
+    </w:p>
+    <w:p>
+      <w:pPr>
         <w:pStyle w:val="Heading2"/>
         <w:spacing w:before="280" w:after="160" w:line="288" w:lineRule="auto"/>
       </w:pPr>
@@ -13754,7 +14606,7 @@
           <w:color w:val="000000"/>
           <w:lang w:eastAsia="zh-HK"/>
         </w:rPr>
-        <w:t>17.4 Judy Chu</w:t>
+        <w:t>17.4 Elaine Yao</w:t>
       </w:r>
     </w:p>
     <w:tbl>
@@ -13942,6 +14794,326 @@
                 <w:color w:val="000000"/>
                 <w:lang w:eastAsia="zh-HK"/>
               </w:rPr>
+              <w:t>+$50</w:t>
+            </w:r>
+          </w:p>
+        </w:tc>
+      </w:tr>
+      <w:tr>
+        <w:tc>
+          <w:tcPr>
+            <w:tcW w:type="dxa" w:w="3024"/>
+            <w:tcBorders>
+              <w:top w:val="single" w:sz="4" w:color="000000" w:space="0"/>
+              <w:left w:val="single" w:sz="4" w:color="000000" w:space="0"/>
+              <w:bottom w:val="single" w:sz="4" w:color="000000" w:space="0"/>
+              <w:right w:val="single" w:sz="4" w:color="000000" w:space="0"/>
+            </w:tcBorders>
+          </w:tcPr>
+          <w:p>
+            <w:pPr>
+              <w:spacing w:before="0" w:after="0" w:line="288" w:lineRule="auto"/>
+            </w:pPr>
+            <w:r/>
+            <w:r>
+              <w:rPr>
+                <w:rFonts w:ascii="新細明體" w:hAnsi="新細明體" w:eastAsia="新細明體"/>
+                <w:b w:val="0"/>
+                <w:i w:val="0"/>
+                <w:color w:val="000000"/>
+                <w:sz w:val="20"/>
+                <w:color w:val="000000"/>
+                <w:lang w:eastAsia="zh-HK"/>
+              </w:rPr>
+              <w:t>高中</w:t>
+            </w:r>
+          </w:p>
+        </w:tc>
+        <w:tc>
+          <w:tcPr>
+            <w:tcW w:type="dxa" w:w="3024"/>
+            <w:tcBorders>
+              <w:top w:val="single" w:sz="4" w:color="000000" w:space="0"/>
+              <w:left w:val="single" w:sz="4" w:color="000000" w:space="0"/>
+              <w:bottom w:val="single" w:sz="4" w:color="000000" w:space="0"/>
+              <w:right w:val="single" w:sz="4" w:color="000000" w:space="0"/>
+            </w:tcBorders>
+          </w:tcPr>
+          <w:p>
+            <w:pPr>
+              <w:spacing w:before="0" w:after="0" w:line="288" w:lineRule="auto"/>
+            </w:pPr>
+            <w:r/>
+            <w:r>
+              <w:rPr>
+                <w:rFonts w:ascii="新細明體" w:hAnsi="新細明體" w:eastAsia="新細明體"/>
+                <w:b w:val="0"/>
+                <w:i w:val="0"/>
+                <w:color w:val="000000"/>
+                <w:sz w:val="20"/>
+                <w:color w:val="000000"/>
+                <w:lang w:eastAsia="zh-HK"/>
+              </w:rPr>
+              <w:t>$150</w:t>
+            </w:r>
+          </w:p>
+        </w:tc>
+        <w:tc>
+          <w:tcPr>
+            <w:tcW w:type="dxa" w:w="3024"/>
+            <w:tcBorders>
+              <w:top w:val="single" w:sz="4" w:color="000000" w:space="0"/>
+              <w:left w:val="single" w:sz="4" w:color="000000" w:space="0"/>
+              <w:bottom w:val="single" w:sz="4" w:color="000000" w:space="0"/>
+              <w:right w:val="single" w:sz="4" w:color="000000" w:space="0"/>
+            </w:tcBorders>
+          </w:tcPr>
+          <w:p>
+            <w:pPr>
+              <w:spacing w:before="0" w:after="0" w:line="288" w:lineRule="auto"/>
+            </w:pPr>
+            <w:r/>
+            <w:r>
+              <w:rPr>
+                <w:rFonts w:ascii="新細明體" w:hAnsi="新細明體" w:eastAsia="新細明體"/>
+                <w:b w:val="0"/>
+                <w:i w:val="0"/>
+                <w:color w:val="000000"/>
+                <w:sz w:val="20"/>
+                <w:color w:val="000000"/>
+                <w:lang w:eastAsia="zh-HK"/>
+              </w:rPr>
+              <w:t>+$70</w:t>
+            </w:r>
+          </w:p>
+        </w:tc>
+      </w:tr>
+    </w:tbl>
+    <w:p>
+      <w:pPr>
+        <w:spacing w:after="200"/>
+      </w:pPr>
+    </w:p>
+    <w:p>
+      <w:pPr>
+        <w:spacing w:after="160" w:line="324" w:lineRule="auto"/>
+      </w:pPr>
+      <w:r>
+        <w:rPr>
+          <w:rFonts w:ascii="新細明體" w:hAnsi="新細明體" w:eastAsia="新細明體"/>
+          <w:b w:val="0"/>
+          <w:i w:val="0"/>
+          <w:color w:val="000000"/>
+          <w:sz w:val="22"/>
+          <w:color w:val="000000"/>
+          <w:lang w:eastAsia="zh-HK"/>
+        </w:rPr>
+        <w:t>一對一＝3 人頭；一對二＝4 人頭。功輔時薪 $100／小時。</w:t>
+      </w:r>
+    </w:p>
+    <w:p>
+      <w:pPr>
+        <w:pStyle w:val="Heading2"/>
+        <w:spacing w:before="280" w:after="160" w:line="288" w:lineRule="auto"/>
+      </w:pPr>
+      <w:r>
+        <w:rPr>
+          <w:rFonts w:ascii="新細明體" w:hAnsi="新細明體" w:eastAsia="新細明體"/>
+          <w:b/>
+          <w:i w:val="0"/>
+          <w:color w:val="000000"/>
+          <w:sz w:val="24"/>
+          <w:color w:val="000000"/>
+          <w:lang w:eastAsia="zh-HK"/>
+        </w:rPr>
+        <w:t>17.5 Judy Chu</w:t>
+      </w:r>
+    </w:p>
+    <w:tbl>
+      <w:tblPr>
+        <w:tblStyle w:val="TableGrid"/>
+        <w:tblW w:type="auto" w:w="0"/>
+        <w:tblLayout w:type="autofit"/>
+        <w:tblLook w:firstColumn="1" w:firstRow="1" w:lastColumn="0" w:lastRow="0" w:noHBand="0" w:noVBand="1" w:val="04A0"/>
+      </w:tblPr>
+      <w:tblGrid>
+        <w:gridCol w:w="3024"/>
+        <w:gridCol w:w="3024"/>
+        <w:gridCol w:w="3024"/>
+      </w:tblGrid>
+      <w:tr>
+        <w:tc>
+          <w:tcPr>
+            <w:tcW w:type="dxa" w:w="3024"/>
+            <w:tcBorders>
+              <w:top w:val="single" w:sz="4" w:color="000000" w:space="0"/>
+              <w:left w:val="single" w:sz="4" w:color="000000" w:space="0"/>
+              <w:bottom w:val="single" w:sz="4" w:color="000000" w:space="0"/>
+              <w:right w:val="single" w:sz="4" w:color="000000" w:space="0"/>
+            </w:tcBorders>
+          </w:tcPr>
+          <w:p>
+            <w:pPr>
+              <w:spacing w:before="0" w:after="0" w:line="288" w:lineRule="auto"/>
+            </w:pPr>
+            <w:r/>
+            <w:r>
+              <w:rPr>
+                <w:rFonts w:ascii="新細明體" w:hAnsi="新細明體" w:eastAsia="新細明體"/>
+                <w:b/>
+                <w:i w:val="0"/>
+                <w:color w:val="000000"/>
+                <w:sz w:val="20"/>
+                <w:color w:val="000000"/>
+                <w:lang w:eastAsia="zh-HK"/>
+              </w:rPr>
+              <w:t>級別</w:t>
+            </w:r>
+          </w:p>
+        </w:tc>
+        <w:tc>
+          <w:tcPr>
+            <w:tcW w:type="dxa" w:w="3024"/>
+            <w:tcBorders>
+              <w:top w:val="single" w:sz="4" w:color="000000" w:space="0"/>
+              <w:left w:val="single" w:sz="4" w:color="000000" w:space="0"/>
+              <w:bottom w:val="single" w:sz="4" w:color="000000" w:space="0"/>
+              <w:right w:val="single" w:sz="4" w:color="000000" w:space="0"/>
+            </w:tcBorders>
+          </w:tcPr>
+          <w:p>
+            <w:pPr>
+              <w:spacing w:before="0" w:after="0" w:line="288" w:lineRule="auto"/>
+            </w:pPr>
+            <w:r/>
+            <w:r>
+              <w:rPr>
+                <w:rFonts w:ascii="新細明體" w:hAnsi="新細明體" w:eastAsia="新細明體"/>
+                <w:b/>
+                <w:i w:val="0"/>
+                <w:color w:val="000000"/>
+                <w:sz w:val="20"/>
+                <w:color w:val="000000"/>
+                <w:lang w:eastAsia="zh-HK"/>
+              </w:rPr>
+              <w:t>第一人頭</w:t>
+            </w:r>
+          </w:p>
+        </w:tc>
+        <w:tc>
+          <w:tcPr>
+            <w:tcW w:type="dxa" w:w="3024"/>
+            <w:tcBorders>
+              <w:top w:val="single" w:sz="4" w:color="000000" w:space="0"/>
+              <w:left w:val="single" w:sz="4" w:color="000000" w:space="0"/>
+              <w:bottom w:val="single" w:sz="4" w:color="000000" w:space="0"/>
+              <w:right w:val="single" w:sz="4" w:color="000000" w:space="0"/>
+            </w:tcBorders>
+          </w:tcPr>
+          <w:p>
+            <w:pPr>
+              <w:spacing w:before="0" w:after="0" w:line="288" w:lineRule="auto"/>
+            </w:pPr>
+            <w:r/>
+            <w:r>
+              <w:rPr>
+                <w:rFonts w:ascii="新細明體" w:hAnsi="新細明體" w:eastAsia="新細明體"/>
+                <w:b/>
+                <w:i w:val="0"/>
+                <w:color w:val="000000"/>
+                <w:sz w:val="20"/>
+                <w:color w:val="000000"/>
+                <w:lang w:eastAsia="zh-HK"/>
+              </w:rPr>
+              <w:t>其後每人頭</w:t>
+            </w:r>
+          </w:p>
+        </w:tc>
+      </w:tr>
+      <w:tr>
+        <w:tc>
+          <w:tcPr>
+            <w:tcW w:type="dxa" w:w="3024"/>
+            <w:tcBorders>
+              <w:top w:val="single" w:sz="4" w:color="000000" w:space="0"/>
+              <w:left w:val="single" w:sz="4" w:color="000000" w:space="0"/>
+              <w:bottom w:val="single" w:sz="4" w:color="000000" w:space="0"/>
+              <w:right w:val="single" w:sz="4" w:color="000000" w:space="0"/>
+            </w:tcBorders>
+          </w:tcPr>
+          <w:p>
+            <w:pPr>
+              <w:spacing w:before="0" w:after="0" w:line="288" w:lineRule="auto"/>
+            </w:pPr>
+            <w:r/>
+            <w:r>
+              <w:rPr>
+                <w:rFonts w:ascii="新細明體" w:hAnsi="新細明體" w:eastAsia="新細明體"/>
+                <w:b w:val="0"/>
+                <w:i w:val="0"/>
+                <w:color w:val="000000"/>
+                <w:sz w:val="20"/>
+                <w:color w:val="000000"/>
+                <w:lang w:eastAsia="zh-HK"/>
+              </w:rPr>
+              <w:t>初中</w:t>
+            </w:r>
+          </w:p>
+        </w:tc>
+        <w:tc>
+          <w:tcPr>
+            <w:tcW w:type="dxa" w:w="3024"/>
+            <w:tcBorders>
+              <w:top w:val="single" w:sz="4" w:color="000000" w:space="0"/>
+              <w:left w:val="single" w:sz="4" w:color="000000" w:space="0"/>
+              <w:bottom w:val="single" w:sz="4" w:color="000000" w:space="0"/>
+              <w:right w:val="single" w:sz="4" w:color="000000" w:space="0"/>
+            </w:tcBorders>
+          </w:tcPr>
+          <w:p>
+            <w:pPr>
+              <w:spacing w:before="0" w:after="0" w:line="288" w:lineRule="auto"/>
+            </w:pPr>
+            <w:r/>
+            <w:r>
+              <w:rPr>
+                <w:rFonts w:ascii="新細明體" w:hAnsi="新細明體" w:eastAsia="新細明體"/>
+                <w:b w:val="0"/>
+                <w:i w:val="0"/>
+                <w:color w:val="000000"/>
+                <w:sz w:val="20"/>
+                <w:color w:val="000000"/>
+                <w:lang w:eastAsia="zh-HK"/>
+              </w:rPr>
+              <w:t>$120</w:t>
+            </w:r>
+          </w:p>
+        </w:tc>
+        <w:tc>
+          <w:tcPr>
+            <w:tcW w:type="dxa" w:w="3024"/>
+            <w:tcBorders>
+              <w:top w:val="single" w:sz="4" w:color="000000" w:space="0"/>
+              <w:left w:val="single" w:sz="4" w:color="000000" w:space="0"/>
+              <w:bottom w:val="single" w:sz="4" w:color="000000" w:space="0"/>
+              <w:right w:val="single" w:sz="4" w:color="000000" w:space="0"/>
+            </w:tcBorders>
+          </w:tcPr>
+          <w:p>
+            <w:pPr>
+              <w:spacing w:before="0" w:after="0" w:line="288" w:lineRule="auto"/>
+            </w:pPr>
+            <w:r/>
+            <w:r>
+              <w:rPr>
+                <w:rFonts w:ascii="新細明體" w:hAnsi="新細明體" w:eastAsia="新細明體"/>
+                <w:b w:val="0"/>
+                <w:i w:val="0"/>
+                <w:color w:val="000000"/>
+                <w:sz w:val="20"/>
+                <w:color w:val="000000"/>
+                <w:lang w:eastAsia="zh-HK"/>
+              </w:rPr>
               <w:t>+$70</w:t>
             </w:r>
           </w:p>
@@ -14057,7 +15229,7 @@
           <w:color w:val="000000"/>
           <w:lang w:eastAsia="zh-HK"/>
         </w:rPr>
-        <w:t>17.5 Jackson Lau（Sum）／Cyndi Ng</w:t>
+        <w:t>17.6 Jackson Lau（Sum）／Cyndi Ng</w:t>
       </w:r>
     </w:p>
     <w:tbl>
@@ -14448,7 +15620,7 @@
           <w:color w:val="000000"/>
           <w:lang w:eastAsia="zh-HK"/>
         </w:rPr>
-        <w:t>17.6 Cody Cheong</w:t>
+        <w:t>17.7 Cody Cheong</w:t>
       </w:r>
     </w:p>
     <w:p>
@@ -14483,7 +15655,7 @@
           <w:color w:val="000000"/>
           <w:lang w:eastAsia="zh-HK"/>
         </w:rPr>
-        <w:t>17.7 Natalie Kwok 私人課程一對一</w:t>
+        <w:t>17.8 Natalie Kwok 私人課程一對一</w:t>
       </w:r>
     </w:p>
     <w:p>
@@ -14518,7 +15690,7 @@
           <w:color w:val="000000"/>
           <w:lang w:eastAsia="zh-HK"/>
         </w:rPr>
-        <w:t>17.8 強積金速查</w:t>
+        <w:t>17.9 強積金速查</w:t>
       </w:r>
     </w:p>
     <w:p>

</xml_diff>

<commit_message>
Raise Leo Chan homework tutoring rate to $100/hr from Sep 2026.
Update payroll_homework_rates and PAYROLL_GUIDE so Leo moves from the $70 band to $100.
</commit_message>
<xml_diff>
--- a/docs/generated/payroll/PAYROLL_GUIDE.docx
+++ b/docs/generated/payroll/PAYROLL_GUIDE.docx
@@ -9547,6 +9547,48 @@
           <w:lang w:eastAsia="zh-HK"/>
         </w:rPr>
         <w:t>：兼職專科班人頭薪酬 ＋ 功輔時薪（見第 16 章）</w:t>
+      </w:r>
+    </w:p>
+    <w:p>
+      <w:pPr>
+        <w:spacing w:before="20" w:after="80" w:line="324" w:lineRule="auto"/>
+        <w:ind w:left="425" w:hanging="227"/>
+      </w:pPr>
+      <w:r>
+        <w:rPr>
+          <w:rFonts w:ascii="新細明體" w:hAnsi="新細明體" w:eastAsia="新細明體"/>
+          <w:b w:val="0"/>
+          <w:i w:val="0"/>
+          <w:color w:val="000000"/>
+          <w:sz w:val="22"/>
+          <w:color w:val="000000"/>
+          <w:lang w:eastAsia="zh-HK"/>
+        </w:rPr>
+        <w:t xml:space="preserve">• </w:t>
+      </w:r>
+      <w:r>
+        <w:rPr>
+          <w:rFonts w:ascii="新細明體" w:hAnsi="新細明體" w:eastAsia="新細明體"/>
+          <w:b/>
+          <w:i w:val="0"/>
+          <w:color w:val="000000"/>
+          <w:sz w:val="22"/>
+          <w:color w:val="000000"/>
+          <w:lang w:eastAsia="zh-HK"/>
+        </w:rPr>
+        <w:t>Elaine Yao</w:t>
+      </w:r>
+      <w:r>
+        <w:rPr>
+          <w:rFonts w:ascii="新細明體" w:hAnsi="新細明體" w:eastAsia="新細明體"/>
+          <w:b w:val="0"/>
+          <w:i w:val="0"/>
+          <w:color w:val="000000"/>
+          <w:sz w:val="22"/>
+          <w:color w:val="000000"/>
+          <w:lang w:eastAsia="zh-HK"/>
+        </w:rPr>
+        <w:t>：兼職專科班人頭薪酬（初中 +$50；見第 7.6 節）＋ 功輔時薪（見第 16 章）</w:t>
       </w:r>
     </w:p>
     <w:p>
@@ -13208,7 +13250,7 @@
                 <w:color w:val="000000"/>
                 <w:lang w:eastAsia="zh-HK"/>
               </w:rPr>
-              <w:t>Jeffrey Lee、Ken Tam、Leo Chan</w:t>
+              <w:t>Jeffrey Lee、Ken Tam</w:t>
             </w:r>
           </w:p>
         </w:tc>
@@ -13268,7 +13310,7 @@
                 <w:color w:val="000000"/>
                 <w:lang w:eastAsia="zh-HK"/>
               </w:rPr>
-              <w:t>Rain Kwok、Annie Leung、Erika Fok、Wing Chan、Liam Lai、Christine Fan、Kenneth Li、Elaine Yao</w:t>
+              <w:t>Rain Kwok、Annie Leung、Erika Fok、Wing Chan、Liam Lai、Christine Fan、Kenneth Li、Elaine Yao、Leo Chan</w:t>
             </w:r>
           </w:p>
         </w:tc>

</xml_diff>